<commit_message>
docs: revise M1 and M2 reports from review feedback
</commit_message>
<xml_diff>
--- a/docs/requirements/vision-and-scope.docx
+++ b/docs/requirements/vision-and-scope.docx
@@ -79,7 +79,7 @@
           <w:color w:val="000000"/>
           <w:sz w:val="22"/>
         </w:rPr>
-        <w:t>跨会话助手需要记住用户事实，也需要处理事实的变化。LangChain 官方文档采用可更新的 JSON 档案或记忆集合，并指出更新可能丢失信息或过度覆盖 [1]。Zep 官方示例中，Kendra 因 Adidas 鞋损坏转而喜欢 Puma，系统尝试将旧偏好标为失效并保存新事实 [2]。这是已有产品的文档示例，不是本组的用户调查。</w:t>
+        <w:t>跨会话助手需要记住用户事实，也需要处理事实的变化。LangChain 官方文档讨论 JSON 档案与记忆集合，指出新增、更新与整合需要权衡，过度或不足的抽取会影响后续检索 [1]。Zep 官方示例中，Kendra 因 Adidas 鞋损坏转而喜欢 Puma，系统尝试将旧偏好标为失效并保存新事实 [2]。</w:t>
       </w:r>
     </w:p>
     <w:p>
@@ -92,7 +92,7 @@
           <w:color w:val="000000"/>
           <w:sz w:val="22"/>
         </w:rPr>
-        <w:t>本项目聚焦一个可检验的问题：检索到相关历史后，怎样判断它是否适用于问题所指的时间？我们计划开发基于课程 LoCoMo 数据的 Web 应用，提取带人物、时间和来源的结构化 Memory，保留历史与状态关系，维护 Current State；提问时结合关键词、语义和结构化条件找候选，再选择有效证据。用户可以查看原始轮次及状态判断过程。</w:t>
+        <w:t>本项目聚焦一个可检验的问题：检索到相关历史后，怎样判断它在问题所指的时间和状态下是否仍然有效？我们计划开发基于课程 LoCoMo 数据的 Web 应用，提取带人物、时间和来源的结构化 Memory，保留历史与状态关系，维护 Current State；提问时由 LLM 辅助分析问题，再结合原始问题、关键词、语义和结构化条件找候选，再选择有效证据。用户可以查看原始轮次及状态判断过程。</w:t>
       </w:r>
     </w:p>
     <w:p>
@@ -445,7 +445,7 @@
                 <w:color w:val="000000"/>
                 <w:sz w:val="20"/>
               </w:rPr>
-              <w:t>结合 BM25、Vector 与 Entity/Time 条件，返回可追溯候选</w:t>
+              <w:t>LLM 辅助提取 Entity/Topic/Time/Keywords，保留原始问题并融合多路候选</w:t>
             </w:r>
           </w:p>
         </w:tc>
@@ -504,7 +504,7 @@
                 <w:color w:val="000000"/>
                 <w:sz w:val="20"/>
               </w:rPr>
-              <w:t>按问题时间选择证据，展示未消解冲突与证据不足</w:t>
+              <w:t>结合问题时间与状态关系选择有效证据，展示冲突与证据不足</w:t>
             </w:r>
           </w:p>
         </w:tc>
@@ -721,7 +721,7 @@
           <w:color w:val="000000"/>
           <w:sz w:val="22"/>
         </w:rPr>
-        <w:t>首版覆盖上述链路。图谱、多跳、合并压缩、复杂冲突消解与自适应检索为候选扩展，不承诺公众账户、外部搜索或图片理解。M2 确定宏观方法及路线，数据库、接口与 Prompt 留待 M3；尚无运行及效果结论。</w:t>
+        <w:t>首版覆盖上述链路。图谱、多跳、合并压缩、复杂冲突消解与自适应检索为候选扩展，不承诺公众账户、外部搜索或图片理解。M2 确定宏观方法及路线，数据库、接口与 Prompt 留待 M3。</w:t>
       </w:r>
     </w:p>
     <w:p>
@@ -749,7 +749,7 @@
           <w:color w:val="000000"/>
           <w:sz w:val="22"/>
         </w:rPr>
-        <w:t>方案由 Memory Construction、Memory Repository、Hybrid Retrieval、State Resolution 和 Answer / Evidence 展示构成。记录流程维护可复用的历史，查询流程根据问题选择有效证据。两条流程通过同一记忆仓库衔接。</w:t>
+        <w:t>方案由 Memory Construction、Memory Repository、Query Analysis、Hybrid Retrieval、State Resolution 和 Answer / Evidence 展示构成。记录流程维护可复用的历史，查询流程根据问题选择有效证据。两条流程通过同一记忆仓库衔接。</w:t>
       </w:r>
     </w:p>
     <w:p>
@@ -1030,7 +1030,7 @@
                 <w:color w:val="000000"/>
                 <w:sz w:val="20"/>
               </w:rPr>
-              <w:t>Hybrid Retrieval</w:t>
+              <w:t>Query Analysis</w:t>
             </w:r>
           </w:p>
         </w:tc>
@@ -1057,7 +1057,7 @@
                 <w:color w:val="000000"/>
                 <w:sz w:val="20"/>
               </w:rPr>
-              <w:t>理解问题的对象与时间，合并关键词、向量及结构化条件找到的候选</w:t>
+              <w:t>LLM 辅助提取 Entity/Topic/Time/Keywords；不确定条件留空，保留原始问题</w:t>
             </w:r>
           </w:p>
         </w:tc>
@@ -1089,7 +1089,7 @@
                 <w:color w:val="000000"/>
                 <w:sz w:val="20"/>
               </w:rPr>
-              <w:t>State Resolution</w:t>
+              <w:t>Hybrid Retrieval</w:t>
             </w:r>
           </w:p>
         </w:tc>
@@ -1116,7 +1116,7 @@
                 <w:color w:val="000000"/>
                 <w:sz w:val="20"/>
               </w:rPr>
-              <w:t>结合历史、关系及问题时间，选择有效 Memory 或说明不确定性</w:t>
+              <w:t>原始问题参与 BM25 与 Vector，分析结果增强检索，合并去重候选</w:t>
             </w:r>
           </w:p>
         </w:tc>
@@ -1148,6 +1148,65 @@
                 <w:color w:val="000000"/>
                 <w:sz w:val="20"/>
               </w:rPr>
+              <w:t>State Resolution</w:t>
+            </w:r>
+          </w:p>
+        </w:tc>
+        <w:tc>
+          <w:tcPr>
+            <w:tcW w:type="dxa" w:w="7030"/>
+            <w:vAlign w:val="center"/>
+            <w:shd w:fill="FFFFFF"/>
+            <w:tcMar>
+              <w:top w:w="65" w:type="dxa"/>
+              <w:bottom w:w="65" w:type="dxa"/>
+              <w:left w:w="95" w:type="dxa"/>
+              <w:right w:w="95" w:type="dxa"/>
+            </w:tcMar>
+          </w:tcPr>
+          <w:p>
+            <w:pPr>
+              <w:spacing w:after="0" w:before="0" w:line="259" w:lineRule="auto"/>
+            </w:pPr>
+            <w:r>
+              <w:rPr>
+                <w:rFonts w:ascii="Noto Sans CJK SC" w:hAnsi="Noto Sans CJK SC" w:eastAsia="Noto Sans CJK SC" w:cs="Noto Sans CJK SC"/>
+                <w:b w:val="0"/>
+                <w:color w:val="000000"/>
+                <w:sz w:val="20"/>
+              </w:rPr>
+              <w:t>结合历史、关系及问题时间与状态，选择有效 Memory 或说明不确定性</w:t>
+            </w:r>
+          </w:p>
+        </w:tc>
+      </w:tr>
+      <w:tr>
+        <w:trPr>
+          <w:cantSplit/>
+        </w:trPr>
+        <w:tc>
+          <w:tcPr>
+            <w:tcW w:type="dxa" w:w="2381"/>
+            <w:vAlign w:val="center"/>
+            <w:shd w:fill="F6F8FA"/>
+            <w:tcMar>
+              <w:top w:w="65" w:type="dxa"/>
+              <w:bottom w:w="65" w:type="dxa"/>
+              <w:left w:w="95" w:type="dxa"/>
+              <w:right w:w="95" w:type="dxa"/>
+            </w:tcMar>
+          </w:tcPr>
+          <w:p>
+            <w:pPr>
+              <w:spacing w:after="0" w:before="0" w:line="259" w:lineRule="auto"/>
+            </w:pPr>
+            <w:r>
+              <w:rPr>
+                <w:rFonts w:ascii="Noto Sans CJK SC" w:hAnsi="Noto Sans CJK SC" w:eastAsia="Noto Sans CJK SC" w:cs="Noto Sans CJK SC"/>
+                <w:b w:val="0"/>
+                <w:color w:val="000000"/>
+                <w:sz w:val="20"/>
+              </w:rPr>
               <w:t>Answer 与证据展示</w:t>
             </w:r>
           </w:p>
@@ -1156,7 +1215,7 @@
           <w:tcPr>
             <w:tcW w:type="dxa" w:w="7030"/>
             <w:vAlign w:val="center"/>
-            <w:shd w:fill="FFFFFF"/>
+            <w:shd w:fill="F6F8FA"/>
             <w:tcMar>
               <w:top w:w="65" w:type="dxa"/>
               <w:bottom w:w="65" w:type="dxa"/>
@@ -1214,7 +1273,7 @@
           <w:color w:val="000000"/>
           <w:sz w:val="22"/>
         </w:rPr>
-        <w:t>全组已确认此宏观路线。采用大模型辅助抽取与语义理解，规则负责可核查的字段、来源和明确时间；具体技术栈不在 M2 锁定。图谱扩展不属于核心架构实施前提。</w:t>
+        <w:t>采用大模型辅助抽取与语义理解，规则负责可核查的字段、来源和明确时间。</w:t>
       </w:r>
     </w:p>
     <w:p>
@@ -1242,7 +1301,7 @@
           <w:color w:val="000000"/>
           <w:sz w:val="22"/>
         </w:rPr>
-        <w:t>记录流程先提取 Memory 并保存来源，再与相关历史比较，维护关系和 Current State。查询流程先找相关 Memory，再按问题与时间条件判断哪些证据有效。状态变化不意味着历史事实被删除。</w:t>
+        <w:t>记录流程先提取 Memory 并保存来源，再与相关历史比较，维护关系和 Current State。查询流程先由 LLM 辅助分析问题，再检索候选并结合时间与状态关系选证据。原始问题始终参与检索；分析失败时回退到原始问题，推断条件不直接排除候选。</w:t>
       </w:r>
     </w:p>
     <w:p>
@@ -1296,7 +1355,7 @@
           <w:color w:val="000000"/>
           <w:sz w:val="18"/>
         </w:rPr>
-        <w:t>图 2 Memory Recording / Retrieval。检索后的状态解析区分“与问题有关”与“适用于问题时间”。</w:t>
+        <w:t>图 2 Memory Recording / Retrieval。检索后的状态解析区分“与问题有关”与“适用于问题时间与状态”。</w:t>
       </w:r>
     </w:p>
     <w:tbl>
@@ -1635,7 +1694,7 @@
           <w:color w:val="000000"/>
           <w:sz w:val="22"/>
         </w:rPr>
-        <w:t>RETAIN 表示继续保留可用记忆；UPDATE / SUPERSEDE 描述推进或替代关系；CONFLICT 表示证据尚不足以消解矛盾。UPDATE 与 SUPERSEDE 的精确标签边界按课程标注和评测口径核实。时间更新本身不足以证明一条记录应被替代。</w:t>
+        <w:t>暂定定义：RETAIN 表示新信息未否定旧记忆；UPDATE 表示同一状态或事件的后续推进；SUPERSEDE 表示新事实使旧事实在对应状态语境下失效；CONFLICT 表示证据矛盾尚无法消解。旧证据均保留，标签边界在 M3 对齐课程口径。时间较新本身不足以证明替代关系。</w:t>
       </w:r>
     </w:p>
     <w:p>
@@ -1799,7 +1858,7 @@
                 <w:color w:val="000000"/>
                 <w:sz w:val="20"/>
               </w:rPr>
-              <w:t>结构化记忆可跨会话保存；官方提示过度新增、过度更新及上下文丢失风险，抽取结果必须保留来源</w:t>
+              <w:t>结构化记忆可跨会话保存；新增、更新及抽取粒度需权衡，本项目保留来源以检查漏记和误更新</w:t>
             </w:r>
           </w:p>
         </w:tc>
@@ -1831,7 +1890,7 @@
                 <w:color w:val="000000"/>
                 <w:sz w:val="20"/>
               </w:rPr>
-              <w:t>Zep / Graphiti 的时间事实 [2]</w:t>
+              <w:t>Zep / Graphiti 的时间事实 [2][3]</w:t>
             </w:r>
           </w:p>
         </w:tc>
@@ -1890,7 +1949,7 @@
                 <w:color w:val="000000"/>
                 <w:sz w:val="20"/>
               </w:rPr>
-              <w:t>Elasticsearch 的混合检索 [3]</w:t>
+              <w:t>Elasticsearch 的混合检索 [4]</w:t>
             </w:r>
           </w:p>
         </w:tc>
@@ -1943,7 +2002,7 @@
           <w:color w:val="000000"/>
           <w:sz w:val="22"/>
         </w:rPr>
-        <w:t>首版采用结构化历史与 Current State，检索后依据问题时间选证据。单纯时间优先难以回答历史问题，单一向量检索保留为对照；图谱与多跳列为扩展。上表是机制参考，不承诺采用这些产品，也不声称本组方案优于它们。</w:t>
+        <w:t>首版采用结构化历史与 Current State，检索后结合问题时间与状态关系选证据。单纯时间优先难以回答历史问题，单一向量检索保留为对照；图谱与多跳列为扩展。</w:t>
       </w:r>
     </w:p>
     <w:p>
@@ -1956,7 +2015,7 @@
           <w:color w:val="000000"/>
           <w:sz w:val="22"/>
         </w:rPr>
-        <w:t>大模型辅助抽取和语义理解，规则核查字段、来源及可明确换算的时间。无法确定的人物、时间与冲突保留不确定性。混合候选先合并去重，再判断状态；Entity/Time 策略在开发集验证，避免过早删掉变化前的证据。融合算法、数据库与 Prompt 留待 M3。</w:t>
+        <w:t>大模型辅助抽取和语义理解，规则核查字段、来源及可明确换算的时间。无法确定的人物、时间与冲突保留不确定性。混合候选先合并去重，再判断状态；Entity/Time 策略在开发集验证，避免过早删掉变化前的证据。</w:t>
       </w:r>
     </w:p>
     <w:p>
@@ -1983,7 +2042,7 @@
           <w:color w:val="000000"/>
           <w:sz w:val="22"/>
         </w:rPr>
-        <w:t>LoCoMo 由 LLM 生成对话后经人工核验编辑，论文明确承认它不能完全反映真实交流 [4]。课程指定 6 段对话，4 开发、2 独立测试，划分以课程通知为准。测试集不用于调参，QA 答案只供评价。</w:t>
+        <w:t>LoCoMo 由 LLM 生成对话后经人工核验编辑，论文明确承认它不能完全反映真实交流 [5]。课程指定 6 段对话，4 开发、2 独立测试，划分以课程通知为准。测试集不用于调参，QA 答案只供评价。</w:t>
       </w:r>
     </w:p>
     <w:p>
@@ -1996,7 +2055,7 @@
           <w:color w:val="000000"/>
           <w:sz w:val="22"/>
         </w:rPr>
-        <w:t>LongMemEval 将知识更新、时间推理与无法回答时拒答列为评价能力 [5]。因此，本项目除课程指标外，记录当前、历史、冲突和证据不足案例；案例检查不等于新增标准基准，也不能外推成真实用户效果。</w:t>
+        <w:t>LongMemEval 将知识更新、时间推理与无法回答时拒答列为评价能力 [6]。因此，本项目除课程指标外，记录当前、历史、冲突和证据不足案例。</w:t>
       </w:r>
     </w:p>
     <w:tbl>
@@ -2363,7 +2422,7 @@
           <w:color w:val="000000"/>
           <w:sz w:val="22"/>
         </w:rPr>
-        <w:t>各阶段安排首轮、优化、验收与缓冲。M3/M4 重叠，共享团队投入，按已明确的需求逐步实施；下表为计划。</w:t>
+        <w:t>功能演进为：M2 定范围 → M3 定义验收 → M4 跑通 F01–F06 → M5 完善核心并交付 F07–F08。M3/M4 重叠，共享投入；下表均为计划。</w:t>
       </w:r>
     </w:p>
     <w:tbl>
@@ -2613,7 +2672,7 @@
                 <w:color w:val="000000"/>
                 <w:sz w:val="19"/>
               </w:rPr>
-              <w:t>功能、数据、异常、接口边界及可检查验收场景</w:t>
+              <w:t>定义 F01–F08 的需求、数据、异常及验收；优先明确 F01–F06 核心边界</w:t>
             </w:r>
           </w:p>
         </w:tc>
@@ -2699,7 +2758,7 @@
                 <w:color w:val="000000"/>
                 <w:sz w:val="19"/>
               </w:rPr>
-              <w:t>实现导入、Memory、检索、状态选择和 Web 核心链路，提供真实初步测试</w:t>
+              <w:t>核心原型：F01 导入、F02 构建、F03 状态维护、F04 查询分析与混合检索、F05 有效证据、F06 Web</w:t>
             </w:r>
           </w:p>
         </w:tc>
@@ -2785,7 +2844,7 @@
                 <w:color w:val="000000"/>
                 <w:sz w:val="19"/>
               </w:rPr>
-              <w:t>完整系统、JSON、对照实验、失败分析及可复现交付</w:t>
+              <w:t>完善 F01–F06；交付 F07 JSON 导出、F08 评测与基线、失败分析及可复现材料</w:t>
             </w:r>
           </w:p>
         </w:tc>
@@ -2838,7 +2897,7 @@
           <w:color w:val="000000"/>
           <w:sz w:val="22"/>
         </w:rPr>
-        <w:t>日期均为 2026 年。课件截止时间为 M1/M2 10 月 10 日 24:00、M3/M4 10 月 24 日 24:00、M5 11 月 9 日 24:00，实际展示场次与提交口径另按课程通知核对。</w:t>
+        <w:t>候选扩展为图谱、多跳与自适应检索，仅在核心验收通过且资源允许时开展，不占用必做交付。日期均为 2026 年。截止时间为 M1/M2 10 月 10 日 24:00、M3/M4 10 月 24 日 24:00、M5 11 月 9 日 24:00，实际展示场次与提交口径另按课程通知核对。</w:t>
       </w:r>
     </w:p>
     <w:tbl>
@@ -3217,7 +3276,7 @@
           <w:color w:val="000000"/>
           <w:sz w:val="22"/>
         </w:rPr>
-        <w:t>模型平台、model ID、参数与预算，以及课程数据和评测口径待核实。按共同样例分阶段集成，扩展不挤占必做链路。</w:t>
+        <w:t>模型、预算及课程评测口径待核实；按共同样例集成，扩展不挤占核心。</w:t>
       </w:r>
     </w:p>
     <w:p>
@@ -3237,19 +3296,7 @@
     <w:p>
       <w:pPr>
         <w:widowControl/>
-      </w:pPr>
-      <w:r>
-        <w:rPr>
-          <w:rFonts w:ascii="Noto Sans CJK SC" w:hAnsi="Noto Sans CJK SC" w:eastAsia="Noto Sans CJK SC" w:cs="Noto Sans CJK SC"/>
-          <w:color w:val="000000"/>
-          <w:sz w:val="22"/>
-        </w:rPr>
-        <w:t>课程课件第 4、9–13 页及 M1 Team Workflow 确定交付、评测与分工。以下一手资料访问于 2026-10-06；完整调研与采用理由存入过程包。</w:t>
-      </w:r>
-    </w:p>
-    <w:p>
-      <w:pPr>
-        <w:widowControl/>
+        <w:spacing w:after="40"/>
       </w:pPr>
       <w:r>
         <w:rPr>
@@ -3275,12 +3322,13 @@
           <w:color w:val="000000"/>
           <w:sz w:val="18"/>
         </w:rPr>
-        <w:t>.</w:t>
+        <w:t>. 官方文档，访问日期：2026-10-06。</w:t>
       </w:r>
     </w:p>
     <w:p>
       <w:pPr>
         <w:widowControl/>
+        <w:spacing w:after="40"/>
       </w:pPr>
       <w:r>
         <w:rPr>
@@ -3306,7 +3354,21 @@
           <w:color w:val="000000"/>
           <w:sz w:val="18"/>
         </w:rPr>
-        <w:t xml:space="preserve">；Graphiti. </w:t>
+        <w:t>. 官方文档，访问日期：2026-10-06。</w:t>
+      </w:r>
+    </w:p>
+    <w:p>
+      <w:pPr>
+        <w:widowControl/>
+        <w:spacing w:after="40"/>
+      </w:pPr>
+      <w:r>
+        <w:rPr>
+          <w:rFonts w:ascii="Noto Sans CJK SC" w:hAnsi="Noto Sans CJK SC" w:eastAsia="Noto Sans CJK SC" w:cs="Noto Sans CJK SC"/>
+          <w:color w:val="000000"/>
+          <w:sz w:val="18"/>
+        </w:rPr>
+        <w:t xml:space="preserve">[3] Zep. </w:t>
       </w:r>
       <w:hyperlink r:id="rId15">
         <w:r>
@@ -3315,7 +3377,7 @@
             <w:color w:val="000000"/>
             <w:sz w:val="18"/>
           </w:rPr>
-          <w:t>Overview</w:t>
+          <w:t>Graphiti overview</w:t>
         </w:r>
       </w:hyperlink>
       <w:r>
@@ -3324,12 +3386,13 @@
           <w:color w:val="000000"/>
           <w:sz w:val="18"/>
         </w:rPr>
-        <w:t>.</w:t>
+        <w:t>. 官方文档，访问日期：2026-10-06。</w:t>
       </w:r>
     </w:p>
     <w:p>
       <w:pPr>
         <w:widowControl/>
+        <w:spacing w:after="40"/>
       </w:pPr>
       <w:r>
         <w:rPr>
@@ -3337,7 +3400,7 @@
           <w:color w:val="000000"/>
           <w:sz w:val="18"/>
         </w:rPr>
-        <w:t xml:space="preserve">[3] Elastic. </w:t>
+        <w:t xml:space="preserve">[4] Elastic. </w:t>
       </w:r>
       <w:hyperlink r:id="rId16">
         <w:r>
@@ -3346,7 +3409,7 @@
             <w:color w:val="000000"/>
             <w:sz w:val="18"/>
           </w:rPr>
-          <w:t>Ranking and reranking</w:t>
+          <w:t>Hybrid search</w:t>
         </w:r>
       </w:hyperlink>
       <w:r>
@@ -3355,12 +3418,13 @@
           <w:color w:val="000000"/>
           <w:sz w:val="18"/>
         </w:rPr>
-        <w:t>.</w:t>
+        <w:t>. 官方文档，访问日期：2026-10-06。</w:t>
       </w:r>
     </w:p>
     <w:p>
       <w:pPr>
         <w:widowControl/>
+        <w:spacing w:after="40"/>
       </w:pPr>
       <w:r>
         <w:rPr>
@@ -3368,7 +3432,7 @@
           <w:color w:val="000000"/>
           <w:sz w:val="18"/>
         </w:rPr>
-        <w:t xml:space="preserve">[4] Maharana et al. </w:t>
+        <w:t xml:space="preserve">[5] Maharana A. et al. </w:t>
       </w:r>
       <w:hyperlink r:id="rId17">
         <w:r>
@@ -3386,12 +3450,13 @@
           <w:color w:val="000000"/>
           <w:sz w:val="18"/>
         </w:rPr>
-        <w:t>. ACL 2024.</w:t>
+        <w:t>. Proceedings of ACL 2024.</w:t>
       </w:r>
     </w:p>
     <w:p>
       <w:pPr>
         <w:widowControl/>
+        <w:spacing w:after="40"/>
       </w:pPr>
       <w:r>
         <w:rPr>
@@ -3399,7 +3464,7 @@
           <w:color w:val="000000"/>
           <w:sz w:val="18"/>
         </w:rPr>
-        <w:t xml:space="preserve">[5] Wu et al. </w:t>
+        <w:t xml:space="preserve">[6] Wu D. et al. </w:t>
       </w:r>
       <w:hyperlink r:id="rId18">
         <w:r>
@@ -3408,7 +3473,7 @@
             <w:color w:val="000000"/>
             <w:sz w:val="18"/>
           </w:rPr>
-          <w:t>LongMemEval</w:t>
+          <w:t>LongMemEval: Benchmarking Chat Assistants on Long-Term Interactive Memory</w:t>
         </w:r>
       </w:hyperlink>
       <w:r>
@@ -3417,7 +3482,7 @@
           <w:color w:val="000000"/>
           <w:sz w:val="18"/>
         </w:rPr>
-        <w:t>. ICLR 2025.</w:t>
+        <w:t>. ICLR 2025. arXiv:2410.10813.</w:t>
       </w:r>
     </w:p>
     <w:sectPr>

</xml_diff>